<commit_message>
Modulo mantenedor maestros generico completo
</commit_message>
<xml_diff>
--- a/Iniciación WEB.docx
+++ b/Iniciación WEB.docx
@@ -101,14 +101,9 @@
       <w:r>
         <w:t xml:space="preserve"> </w:t>
       </w:r>
-      <w:proofErr w:type="spellStart"/>
       <w:proofErr w:type="gramStart"/>
       <w:r>
-        <w:t>add</w:t>
-      </w:r>
-      <w:proofErr w:type="spellEnd"/>
-      <w:r>
-        <w:t xml:space="preserve"> .</w:t>
+        <w:t>add .</w:t>
       </w:r>
       <w:proofErr w:type="gramEnd"/>
       <w:r>
@@ -131,7 +126,7 @@
         <w:t xml:space="preserve"> -m "</w:t>
       </w:r>
       <w:r>
-        <w:t>cambio logo</w:t>
+        <w:t>creado el módulo cliente</w:t>
       </w:r>
       <w:r>
         <w:t>"</w:t>
@@ -615,6 +610,27 @@
           <w:lang w:val="es-MX"/>
         </w:rPr>
       </w:pPr>
+      <w:proofErr w:type="spellStart"/>
+      <w:r>
+        <w:t>npx</w:t>
+      </w:r>
+      <w:proofErr w:type="spellEnd"/>
+      <w:r>
+        <w:t xml:space="preserve"> prisma </w:t>
+      </w:r>
+      <w:proofErr w:type="spellStart"/>
+      <w:r>
+        <w:t>studio</w:t>
+      </w:r>
+      <w:proofErr w:type="spellEnd"/>
+      <w:r>
+        <w:t xml:space="preserve"> / para levantar la base de datos </w:t>
+      </w:r>
+      <w:proofErr w:type="spellStart"/>
+      <w:r>
+        <w:t>viaulmente</w:t>
+      </w:r>
+      <w:proofErr w:type="spellEnd"/>
     </w:p>
     <w:sectPr>
       <w:pgSz w:w="12240" w:h="15840"/>

</xml_diff>